<commit_message>
corn: add feature export pdf tapi masih ada bug
</commit_message>
<xml_diff>
--- a/assets/templates/default_logbook_template.docx
+++ b/assets/templates/default_logbook_template.docx
@@ -440,6 +440,216 @@
                 <w:b/>
               </w:rPr>
               <w:t xml:space="preserve"> {{mitra}}</w:t>
+            </w:r>
+          </w:p>
+        </w:tc>
+        <w:tc>
+          <w:tcPr>
+            <w:tcW w:w="35" w:type="dxa"/>
+            <w:tcBorders>
+              <w:top w:val="single" w:sz="6" w:space="0" w:color="CCCCCC"/>
+              <w:left w:val="single" w:sz="6" w:space="0" w:color="CCCCCC"/>
+              <w:bottom w:val="single" w:sz="6" w:space="0" w:color="CCCCCC"/>
+              <w:right w:val="single" w:sz="6" w:space="0" w:color="CCCCCC"/>
+            </w:tcBorders>
+            <w:tcMar>
+              <w:top w:w="45" w:type="dxa"/>
+              <w:left w:w="45" w:type="dxa"/>
+              <w:bottom w:w="45" w:type="dxa"/>
+              <w:right w:w="45" w:type="dxa"/>
+            </w:tcMar>
+          </w:tcPr>
+          <w:p>
+            <w:pPr>
+              <w:spacing w:after="0" w:line="240" w:lineRule="auto"/>
+              <w:ind w:left="-54"/>
+              <w:rPr>
+                <w:rFonts w:ascii="Times New Roman" w:hAnsi="Times New Roman" w:cs="Times New Roman"/>
+              </w:rPr>
+            </w:pPr>
+            <w:r>
+              <w:rPr>
+                <w:rFonts w:ascii="Times New Roman" w:hAnsi="Times New Roman" w:cs="Times New Roman"/>
+              </w:rPr>
+              <w:t xml:space="preserve"/>
+            </w:r>
+          </w:p>
+        </w:tc>
+      </w:tr>
+      <w:tr>
+        <w:trPr>
+          <w:trHeight w:val="360"/>
+        </w:trPr>
+        <w:tc>
+          <w:tcPr>
+            <w:tcW w:w="3955" w:type="dxa"/>
+            <w:tcBorders>
+              <w:top w:val="single" w:sz="6" w:space="0" w:color="CCCCCC"/>
+              <w:left w:val="single" w:sz="6" w:space="0" w:color="CCCCCC"/>
+              <w:bottom w:val="single" w:sz="6" w:space="0" w:color="CCCCCC"/>
+              <w:right w:val="single" w:sz="6" w:space="0" w:color="CCCCCC"/>
+            </w:tcBorders>
+            <w:tcMar>
+              <w:top w:w="45" w:type="dxa"/>
+              <w:left w:w="45" w:type="dxa"/>
+              <w:bottom w:w="45" w:type="dxa"/>
+              <w:right w:w="45" w:type="dxa"/>
+            </w:tcMar>
+          </w:tcPr>
+          <w:p>
+            <w:pPr>
+              <w:spacing w:after="0" w:line="240" w:lineRule="auto"/>
+              <w:ind w:left="-54"/>
+              <w:rPr>
+                <w:rFonts w:ascii="Times New Roman" w:hAnsi="Times New Roman" w:cs="Times New Roman"/>
+                <w:b/>
+              </w:rPr>
+            </w:pPr>
+            <w:r>
+              <w:rPr>
+                <w:rFonts w:ascii="Times New Roman" w:hAnsi="Times New Roman" w:cs="Times New Roman"/>
+                <w:b/>
+              </w:rPr>
+              <w:t xml:space="preserve">Dosen Pembimbing</w:t>
+            </w:r>
+          </w:p>
+        </w:tc>
+        <w:tc>
+          <w:tcPr>
+            <w:tcW w:w="5237" w:type="dxa"/>
+            <w:tcBorders>
+              <w:top w:val="single" w:sz="6" w:space="0" w:color="CCCCCC"/>
+              <w:left w:val="single" w:sz="6" w:space="0" w:color="CCCCCC"/>
+              <w:bottom w:val="single" w:sz="6" w:space="0" w:color="CCCCCC"/>
+              <w:right w:val="single" w:sz="6" w:space="0" w:color="CCCCCC"/>
+            </w:tcBorders>
+            <w:tcMar>
+              <w:top w:w="45" w:type="dxa"/>
+              <w:left w:w="45" w:type="dxa"/>
+              <w:bottom w:w="45" w:type="dxa"/>
+              <w:right w:w="45" w:type="dxa"/>
+            </w:tcMar>
+          </w:tcPr>
+          <w:p>
+            <w:pPr>
+              <w:spacing w:after="0" w:line="240" w:lineRule="auto"/>
+              <w:ind w:left="-54"/>
+              <w:rPr>
+                <w:rFonts w:ascii="Times New Roman" w:hAnsi="Times New Roman" w:cs="Times New Roman"/>
+                <w:b/>
+              </w:rPr>
+            </w:pPr>
+            <w:r>
+              <w:rPr>
+                <w:rFonts w:ascii="Times New Roman" w:hAnsi="Times New Roman" w:cs="Times New Roman"/>
+                <w:b/>
+              </w:rPr>
+              <w:t xml:space="preserve"> {{pembimbing}}</w:t>
+            </w:r>
+          </w:p>
+        </w:tc>
+        <w:tc>
+          <w:tcPr>
+            <w:tcW w:w="35" w:type="dxa"/>
+            <w:tcBorders>
+              <w:top w:val="single" w:sz="6" w:space="0" w:color="CCCCCC"/>
+              <w:left w:val="single" w:sz="6" w:space="0" w:color="CCCCCC"/>
+              <w:bottom w:val="single" w:sz="6" w:space="0" w:color="CCCCCC"/>
+              <w:right w:val="single" w:sz="6" w:space="0" w:color="CCCCCC"/>
+            </w:tcBorders>
+            <w:tcMar>
+              <w:top w:w="45" w:type="dxa"/>
+              <w:left w:w="45" w:type="dxa"/>
+              <w:bottom w:w="45" w:type="dxa"/>
+              <w:right w:w="45" w:type="dxa"/>
+            </w:tcMar>
+          </w:tcPr>
+          <w:p>
+            <w:pPr>
+              <w:spacing w:after="0" w:line="240" w:lineRule="auto"/>
+              <w:ind w:left="-54"/>
+              <w:rPr>
+                <w:rFonts w:ascii="Times New Roman" w:hAnsi="Times New Roman" w:cs="Times New Roman"/>
+              </w:rPr>
+            </w:pPr>
+            <w:r>
+              <w:rPr>
+                <w:rFonts w:ascii="Times New Roman" w:hAnsi="Times New Roman" w:cs="Times New Roman"/>
+              </w:rPr>
+              <w:t xml:space="preserve"/>
+            </w:r>
+          </w:p>
+        </w:tc>
+      </w:tr>
+      <w:tr>
+        <w:trPr>
+          <w:trHeight w:val="360"/>
+        </w:trPr>
+        <w:tc>
+          <w:tcPr>
+            <w:tcW w:w="3955" w:type="dxa"/>
+            <w:tcBorders>
+              <w:top w:val="single" w:sz="6" w:space="0" w:color="CCCCCC"/>
+              <w:left w:val="single" w:sz="6" w:space="0" w:color="CCCCCC"/>
+              <w:bottom w:val="single" w:sz="6" w:space="0" w:color="CCCCCC"/>
+              <w:right w:val="single" w:sz="6" w:space="0" w:color="CCCCCC"/>
+            </w:tcBorders>
+            <w:tcMar>
+              <w:top w:w="45" w:type="dxa"/>
+              <w:left w:w="45" w:type="dxa"/>
+              <w:bottom w:w="45" w:type="dxa"/>
+              <w:right w:w="45" w:type="dxa"/>
+            </w:tcMar>
+          </w:tcPr>
+          <w:p>
+            <w:pPr>
+              <w:spacing w:after="0" w:line="240" w:lineRule="auto"/>
+              <w:ind w:left="-54"/>
+              <w:rPr>
+                <w:rFonts w:ascii="Times New Roman" w:hAnsi="Times New Roman" w:cs="Times New Roman"/>
+                <w:b/>
+              </w:rPr>
+            </w:pPr>
+            <w:r>
+              <w:rPr>
+                <w:rFonts w:ascii="Times New Roman" w:hAnsi="Times New Roman" w:cs="Times New Roman"/>
+                <w:b/>
+              </w:rPr>
+              <w:t xml:space="preserve">Pembimbing Lapangan</w:t>
+            </w:r>
+          </w:p>
+        </w:tc>
+        <w:tc>
+          <w:tcPr>
+            <w:tcW w:w="5237" w:type="dxa"/>
+            <w:tcBorders>
+              <w:top w:val="single" w:sz="6" w:space="0" w:color="CCCCCC"/>
+              <w:left w:val="single" w:sz="6" w:space="0" w:color="CCCCCC"/>
+              <w:bottom w:val="single" w:sz="6" w:space="0" w:color="CCCCCC"/>
+              <w:right w:val="single" w:sz="6" w:space="0" w:color="CCCCCC"/>
+            </w:tcBorders>
+            <w:tcMar>
+              <w:top w:w="45" w:type="dxa"/>
+              <w:left w:w="45" w:type="dxa"/>
+              <w:bottom w:w="45" w:type="dxa"/>
+              <w:right w:w="45" w:type="dxa"/>
+            </w:tcMar>
+          </w:tcPr>
+          <w:p>
+            <w:pPr>
+              <w:spacing w:after="0" w:line="240" w:lineRule="auto"/>
+              <w:ind w:left="-54"/>
+              <w:rPr>
+                <w:rFonts w:ascii="Times New Roman" w:hAnsi="Times New Roman" w:cs="Times New Roman"/>
+                <w:b/>
+              </w:rPr>
+            </w:pPr>
+            <w:r>
+              <w:rPr>
+                <w:rFonts w:ascii="Times New Roman" w:hAnsi="Times New Roman" w:cs="Times New Roman"/>
+                <w:b/>
+              </w:rPr>
+              <w:t xml:space="preserve"> {{pembimbing_lapangan}}</w:t>
             </w:r>
           </w:p>
         </w:tc>

</xml_diff>